<commit_message>
am mai adaugat la documentatie
</commit_message>
<xml_diff>
--- a/Documentatie tehnica.docx
+++ b/Documentatie tehnica.docx
@@ -3557,7 +3557,6 @@
                                     <w:text/>
                                   </w:sdtPr>
                                   <w:sdtContent>
-                                    <w:proofErr w:type="spellStart"/>
                                     <w:r>
                                       <w:rPr>
                                         <w:rFonts w:ascii="Times New Roman" w:hAnsi="Times New Roman" w:cs="Times New Roman"/>
@@ -3583,17 +3582,7 @@
                                         <w:sz w:val="32"/>
                                         <w:szCs w:val="32"/>
                                       </w:rPr>
-                                      <w:t>d</w:t>
-                                    </w:r>
-                                    <w:proofErr w:type="spellEnd"/>
-                                    <w:r>
-                                      <w:rPr>
-                                        <w:rFonts w:ascii="Times New Roman" w:hAnsi="Times New Roman" w:cs="Times New Roman"/>
-                                        <w:color w:val="4472C4" w:themeColor="accent1"/>
-                                        <w:sz w:val="32"/>
-                                        <w:szCs w:val="32"/>
-                                      </w:rPr>
-                                      <w:t>. Cap. Drăgan Alessia-Ioana</w:t>
+                                      <w:t>d. Cap. Drăgan Alessia-Ioana</w:t>
                                     </w:r>
                                   </w:sdtContent>
                                 </w:sdt>
@@ -3678,7 +3667,6 @@
                               <w:text/>
                             </w:sdtPr>
                             <w:sdtContent>
-                              <w:proofErr w:type="spellStart"/>
                               <w:r>
                                 <w:rPr>
                                   <w:rFonts w:ascii="Times New Roman" w:hAnsi="Times New Roman" w:cs="Times New Roman"/>
@@ -3704,17 +3692,7 @@
                                   <w:sz w:val="32"/>
                                   <w:szCs w:val="32"/>
                                 </w:rPr>
-                                <w:t>d</w:t>
-                              </w:r>
-                              <w:proofErr w:type="spellEnd"/>
-                              <w:r>
-                                <w:rPr>
-                                  <w:rFonts w:ascii="Times New Roman" w:hAnsi="Times New Roman" w:cs="Times New Roman"/>
-                                  <w:color w:val="4472C4" w:themeColor="accent1"/>
-                                  <w:sz w:val="32"/>
-                                  <w:szCs w:val="32"/>
-                                </w:rPr>
-                                <w:t>. Cap. Drăgan Alessia-Ioana</w:t>
+                                <w:t>d. Cap. Drăgan Alessia-Ioana</w:t>
                               </w:r>
                             </w:sdtContent>
                           </w:sdt>
@@ -6069,9 +6047,284 @@
         </w:drawing>
       </w:r>
     </w:p>
+    <w:p/>
+    <w:p>
+      <w:pPr>
+        <w:pStyle w:val="Titlu2"/>
+        <w:jc w:val="center"/>
+      </w:pPr>
+      <w:r>
+        <w:t xml:space="preserve">2.3. Generarea fișierului HTML </w:t>
+      </w:r>
+    </w:p>
+    <w:p/>
+    <w:p>
+      <w:pPr>
+        <w:ind w:firstLine="708"/>
+        <w:jc w:val="both"/>
+        <w:rPr>
+          <w:rFonts w:ascii="Times New Roman" w:hAnsi="Times New Roman" w:cs="Times New Roman"/>
+        </w:rPr>
+      </w:pPr>
+      <w:r>
+        <w:rPr>
+          <w:rFonts w:ascii="Times New Roman" w:hAnsi="Times New Roman" w:cs="Times New Roman"/>
+        </w:rPr>
+        <w:t>După ce datele din fișierul text sunt verificate, aplicația trece la crearea vizuală a formularului, salvând codul HTML rezultat într-un fișier local pe care utilizatorul îl poate deschide în browser.</w:t>
+      </w:r>
+    </w:p>
+    <w:p>
+      <w:pPr>
+        <w:ind w:firstLine="360"/>
+        <w:jc w:val="both"/>
+        <w:rPr>
+          <w:rFonts w:ascii="Times New Roman" w:hAnsi="Times New Roman" w:cs="Times New Roman"/>
+        </w:rPr>
+      </w:pPr>
+      <w:r>
+        <w:rPr>
+          <w:rFonts w:ascii="Times New Roman" w:hAnsi="Times New Roman" w:cs="Times New Roman"/>
+        </w:rPr>
+        <w:t>Pe scurt, acest proces funcționează astfel:</w:t>
+      </w:r>
+    </w:p>
+    <w:p>
+      <w:pPr>
+        <w:numPr>
+          <w:ilvl w:val="0"/>
+          <w:numId w:val="9"/>
+        </w:numPr>
+        <w:jc w:val="both"/>
+        <w:rPr>
+          <w:rFonts w:ascii="Times New Roman" w:hAnsi="Times New Roman" w:cs="Times New Roman"/>
+        </w:rPr>
+      </w:pPr>
+      <w:r>
+        <w:rPr>
+          <w:rFonts w:ascii="Times New Roman" w:hAnsi="Times New Roman" w:cs="Times New Roman"/>
+          <w:b/>
+          <w:bCs/>
+        </w:rPr>
+        <w:t>Asamblarea paginii:</w:t>
+      </w:r>
+      <w:r>
+        <w:rPr>
+          <w:rFonts w:ascii="Times New Roman" w:hAnsi="Times New Roman" w:cs="Times New Roman"/>
+        </w:rPr>
+        <w:t xml:space="preserve"> Funcția </w:t>
+      </w:r>
+      <w:proofErr w:type="spellStart"/>
+      <w:r>
+        <w:rPr>
+          <w:rFonts w:ascii="Times New Roman" w:hAnsi="Times New Roman" w:cs="Times New Roman"/>
+          <w:i/>
+          <w:iCs/>
+        </w:rPr>
+        <w:t>genereaza_pagina_formular</w:t>
+      </w:r>
+      <w:proofErr w:type="spellEnd"/>
+      <w:r>
+        <w:rPr>
+          <w:rFonts w:ascii="Times New Roman" w:hAnsi="Times New Roman" w:cs="Times New Roman"/>
+        </w:rPr>
+        <w:t xml:space="preserve"> adună toate bucățile de cod HTML create pentru fiecare câmp în parte, adaugă titlul formularului și inserează stilul CSS pentru design.</w:t>
+      </w:r>
+    </w:p>
+    <w:p>
+      <w:pPr>
+        <w:numPr>
+          <w:ilvl w:val="0"/>
+          <w:numId w:val="9"/>
+        </w:numPr>
+        <w:jc w:val="both"/>
+        <w:rPr>
+          <w:rFonts w:ascii="Times New Roman" w:hAnsi="Times New Roman" w:cs="Times New Roman"/>
+        </w:rPr>
+      </w:pPr>
+      <w:r>
+        <w:rPr>
+          <w:rFonts w:ascii="Times New Roman" w:hAnsi="Times New Roman" w:cs="Times New Roman"/>
+          <w:b/>
+          <w:bCs/>
+        </w:rPr>
+        <w:t>Salvarea pe disc:</w:t>
+      </w:r>
+      <w:r>
+        <w:rPr>
+          <w:rFonts w:ascii="Times New Roman" w:hAnsi="Times New Roman" w:cs="Times New Roman"/>
+        </w:rPr>
+        <w:t xml:space="preserve"> Codul HTML complet este scris automat într-un fișier numit pagina_generata.html. Se folosește codificarea utf-8 pentru ca diacriticele să se afișeze corect în browser.</w:t>
+      </w:r>
+    </w:p>
+    <w:p>
+      <w:pPr>
+        <w:numPr>
+          <w:ilvl w:val="0"/>
+          <w:numId w:val="9"/>
+        </w:numPr>
+        <w:jc w:val="both"/>
+        <w:rPr>
+          <w:rFonts w:ascii="Times New Roman" w:hAnsi="Times New Roman" w:cs="Times New Roman"/>
+        </w:rPr>
+      </w:pPr>
+      <w:r>
+        <w:rPr>
+          <w:rFonts w:ascii="Times New Roman" w:hAnsi="Times New Roman" w:cs="Times New Roman"/>
+          <w:b/>
+          <w:bCs/>
+        </w:rPr>
+        <w:t>Confirmarea în terminal:</w:t>
+      </w:r>
+      <w:r>
+        <w:rPr>
+          <w:rFonts w:ascii="Times New Roman" w:hAnsi="Times New Roman" w:cs="Times New Roman"/>
+        </w:rPr>
+        <w:t xml:space="preserve"> La finalul rulării, aplicația afișează în consolă un mesaj care confirmă că fișierul a fost creat cu succes și oferă instrucțiuni simple de deschidere.</w:t>
+      </w:r>
+    </w:p>
+    <w:p/>
+    <w:p>
+      <w:r>
+        <w:drawing>
+          <wp:inline distT="0" distB="0" distL="0" distR="0" wp14:anchorId="6B6FCE74" wp14:editId="040D0DEA">
+            <wp:extent cx="5760720" cy="281940"/>
+            <wp:effectExtent l="0" t="0" r="0" b="3810"/>
+            <wp:docPr id="1874040025" name="Imagine 1"/>
+            <wp:cNvGraphicFramePr>
+              <a:graphicFrameLocks xmlns:a="http://schemas.openxmlformats.org/drawingml/2006/main" noChangeAspect="1"/>
+            </wp:cNvGraphicFramePr>
+            <a:graphic xmlns:a="http://schemas.openxmlformats.org/drawingml/2006/main">
+              <a:graphicData uri="http://schemas.openxmlformats.org/drawingml/2006/picture">
+                <pic:pic xmlns:pic="http://schemas.openxmlformats.org/drawingml/2006/picture">
+                  <pic:nvPicPr>
+                    <pic:cNvPr id="1874040025" name=""/>
+                    <pic:cNvPicPr/>
+                  </pic:nvPicPr>
+                  <pic:blipFill>
+                    <a:blip r:embed="rId9"/>
+                    <a:stretch>
+                      <a:fillRect/>
+                    </a:stretch>
+                  </pic:blipFill>
+                  <pic:spPr>
+                    <a:xfrm>
+                      <a:off x="0" y="0"/>
+                      <a:ext cx="5760720" cy="281940"/>
+                    </a:xfrm>
+                    <a:prstGeom prst="rect">
+                      <a:avLst/>
+                    </a:prstGeom>
+                  </pic:spPr>
+                </pic:pic>
+              </a:graphicData>
+            </a:graphic>
+          </wp:inline>
+        </w:drawing>
+      </w:r>
+    </w:p>
+    <w:p/>
+    <w:p/>
+    <w:p/>
+    <w:p>
+      <w:pPr>
+        <w:rPr>
+          <w:rFonts w:ascii="Times New Roman" w:hAnsi="Times New Roman" w:cs="Times New Roman"/>
+          <w:b/>
+          <w:bCs/>
+          <w:lang w:val="en-US"/>
+        </w:rPr>
+      </w:pPr>
+      <w:r>
+        <w:rPr>
+          <w:rFonts w:ascii="Times New Roman" w:hAnsi="Times New Roman" w:cs="Times New Roman"/>
+          <w:b/>
+          <w:bCs/>
+        </w:rPr>
+        <w:lastRenderedPageBreak/>
+        <w:t>Fișierul HTML rezultat</w:t>
+      </w:r>
+      <w:r>
+        <w:rPr>
+          <w:rFonts w:ascii="Times New Roman" w:hAnsi="Times New Roman" w:cs="Times New Roman"/>
+          <w:b/>
+          <w:bCs/>
+          <w:lang w:val="en-US"/>
+        </w:rPr>
+        <w:t>:</w:t>
+      </w:r>
+    </w:p>
+    <w:p>
+      <w:pPr>
+        <w:rPr>
+          <w:rFonts w:ascii="Times New Roman" w:hAnsi="Times New Roman" w:cs="Times New Roman"/>
+          <w:b/>
+          <w:bCs/>
+          <w:lang w:val="en-US"/>
+        </w:rPr>
+      </w:pPr>
+      <w:proofErr w:type="spellStart"/>
+      <w:r>
+        <w:rPr>
+          <w:rFonts w:ascii="Times New Roman" w:hAnsi="Times New Roman" w:cs="Times New Roman"/>
+          <w:b/>
+          <w:bCs/>
+          <w:lang w:val="en-US"/>
+        </w:rPr>
+        <w:t>Exemplu</w:t>
+      </w:r>
+      <w:proofErr w:type="spellEnd"/>
+      <w:r>
+        <w:rPr>
+          <w:rFonts w:ascii="Times New Roman" w:hAnsi="Times New Roman" w:cs="Times New Roman"/>
+          <w:b/>
+          <w:bCs/>
+          <w:lang w:val="en-US"/>
+        </w:rPr>
+        <w:t>:</w:t>
+      </w:r>
+    </w:p>
+    <w:p>
+      <w:r>
+        <w:drawing>
+          <wp:inline distT="0" distB="0" distL="0" distR="0" wp14:anchorId="28226CF9" wp14:editId="0CC1B420">
+            <wp:extent cx="5760720" cy="3113405"/>
+            <wp:effectExtent l="0" t="0" r="0" b="0"/>
+            <wp:docPr id="883728451" name="Imagine 1"/>
+            <wp:cNvGraphicFramePr>
+              <a:graphicFrameLocks xmlns:a="http://schemas.openxmlformats.org/drawingml/2006/main" noChangeAspect="1"/>
+            </wp:cNvGraphicFramePr>
+            <a:graphic xmlns:a="http://schemas.openxmlformats.org/drawingml/2006/main">
+              <a:graphicData uri="http://schemas.openxmlformats.org/drawingml/2006/picture">
+                <pic:pic xmlns:pic="http://schemas.openxmlformats.org/drawingml/2006/picture">
+                  <pic:nvPicPr>
+                    <pic:cNvPr id="883728451" name=""/>
+                    <pic:cNvPicPr/>
+                  </pic:nvPicPr>
+                  <pic:blipFill>
+                    <a:blip r:embed="rId10"/>
+                    <a:stretch>
+                      <a:fillRect/>
+                    </a:stretch>
+                  </pic:blipFill>
+                  <pic:spPr>
+                    <a:xfrm>
+                      <a:off x="0" y="0"/>
+                      <a:ext cx="5760720" cy="3113405"/>
+                    </a:xfrm>
+                    <a:prstGeom prst="rect">
+                      <a:avLst/>
+                    </a:prstGeom>
+                  </pic:spPr>
+                </pic:pic>
+              </a:graphicData>
+            </a:graphic>
+          </wp:inline>
+        </w:drawing>
+      </w:r>
+    </w:p>
     <w:sectPr>
-      <w:headerReference w:type="default" r:id="rId9"/>
-      <w:footerReference w:type="default" r:id="rId10"/>
+      <w:headerReference w:type="default" r:id="rId11"/>
+      <w:footerReference w:type="default" r:id="rId12"/>
       <w:pgSz w:w="11906" w:h="16838"/>
       <w:pgMar w:top="1417" w:right="1417" w:bottom="1417" w:left="1417" w:header="708" w:footer="708" w:gutter="0"/>
       <w:pgNumType w:start="0"/>
@@ -6672,6 +6925,156 @@
     </w:lvl>
   </w:abstractNum>
   <w:abstractNum w:abstractNumId="3" w15:restartNumberingAfterBreak="0">
+    <w:nsid w:val="15FF006F"/>
+    <w:multiLevelType w:val="multilevel"/>
+    <w:tmpl w:val="4912C972"/>
+    <w:lvl w:ilvl="0">
+      <w:start w:val="1"/>
+      <w:numFmt w:val="bullet"/>
+      <w:lvlText w:val=""/>
+      <w:lvlPicBulletId w:val="0"/>
+      <w:lvlJc w:val="left"/>
+      <w:pPr>
+        <w:tabs>
+          <w:tab w:val="num" w:pos="720"/>
+        </w:tabs>
+        <w:ind w:left="720" w:hanging="360"/>
+      </w:pPr>
+      <w:rPr>
+        <w:rFonts w:ascii="Symbol" w:hAnsi="Symbol" w:hint="default"/>
+        <w:sz w:val="20"/>
+      </w:rPr>
+    </w:lvl>
+    <w:lvl w:ilvl="1" w:tentative="1">
+      <w:start w:val="1"/>
+      <w:numFmt w:val="bullet"/>
+      <w:lvlText w:val="o"/>
+      <w:lvlJc w:val="left"/>
+      <w:pPr>
+        <w:tabs>
+          <w:tab w:val="num" w:pos="1440"/>
+        </w:tabs>
+        <w:ind w:left="1440" w:hanging="360"/>
+      </w:pPr>
+      <w:rPr>
+        <w:rFonts w:ascii="Courier New" w:hAnsi="Courier New" w:hint="default"/>
+        <w:sz w:val="20"/>
+      </w:rPr>
+    </w:lvl>
+    <w:lvl w:ilvl="2" w:tentative="1">
+      <w:start w:val="1"/>
+      <w:numFmt w:val="bullet"/>
+      <w:lvlText w:val=""/>
+      <w:lvlJc w:val="left"/>
+      <w:pPr>
+        <w:tabs>
+          <w:tab w:val="num" w:pos="2160"/>
+        </w:tabs>
+        <w:ind w:left="2160" w:hanging="360"/>
+      </w:pPr>
+      <w:rPr>
+        <w:rFonts w:ascii="Wingdings" w:hAnsi="Wingdings" w:hint="default"/>
+        <w:sz w:val="20"/>
+      </w:rPr>
+    </w:lvl>
+    <w:lvl w:ilvl="3" w:tentative="1">
+      <w:start w:val="1"/>
+      <w:numFmt w:val="bullet"/>
+      <w:lvlText w:val=""/>
+      <w:lvlJc w:val="left"/>
+      <w:pPr>
+        <w:tabs>
+          <w:tab w:val="num" w:pos="2880"/>
+        </w:tabs>
+        <w:ind w:left="2880" w:hanging="360"/>
+      </w:pPr>
+      <w:rPr>
+        <w:rFonts w:ascii="Wingdings" w:hAnsi="Wingdings" w:hint="default"/>
+        <w:sz w:val="20"/>
+      </w:rPr>
+    </w:lvl>
+    <w:lvl w:ilvl="4" w:tentative="1">
+      <w:start w:val="1"/>
+      <w:numFmt w:val="bullet"/>
+      <w:lvlText w:val=""/>
+      <w:lvlJc w:val="left"/>
+      <w:pPr>
+        <w:tabs>
+          <w:tab w:val="num" w:pos="3600"/>
+        </w:tabs>
+        <w:ind w:left="3600" w:hanging="360"/>
+      </w:pPr>
+      <w:rPr>
+        <w:rFonts w:ascii="Wingdings" w:hAnsi="Wingdings" w:hint="default"/>
+        <w:sz w:val="20"/>
+      </w:rPr>
+    </w:lvl>
+    <w:lvl w:ilvl="5" w:tentative="1">
+      <w:start w:val="1"/>
+      <w:numFmt w:val="bullet"/>
+      <w:lvlText w:val=""/>
+      <w:lvlJc w:val="left"/>
+      <w:pPr>
+        <w:tabs>
+          <w:tab w:val="num" w:pos="4320"/>
+        </w:tabs>
+        <w:ind w:left="4320" w:hanging="360"/>
+      </w:pPr>
+      <w:rPr>
+        <w:rFonts w:ascii="Wingdings" w:hAnsi="Wingdings" w:hint="default"/>
+        <w:sz w:val="20"/>
+      </w:rPr>
+    </w:lvl>
+    <w:lvl w:ilvl="6" w:tentative="1">
+      <w:start w:val="1"/>
+      <w:numFmt w:val="bullet"/>
+      <w:lvlText w:val=""/>
+      <w:lvlJc w:val="left"/>
+      <w:pPr>
+        <w:tabs>
+          <w:tab w:val="num" w:pos="5040"/>
+        </w:tabs>
+        <w:ind w:left="5040" w:hanging="360"/>
+      </w:pPr>
+      <w:rPr>
+        <w:rFonts w:ascii="Wingdings" w:hAnsi="Wingdings" w:hint="default"/>
+        <w:sz w:val="20"/>
+      </w:rPr>
+    </w:lvl>
+    <w:lvl w:ilvl="7" w:tentative="1">
+      <w:start w:val="1"/>
+      <w:numFmt w:val="bullet"/>
+      <w:lvlText w:val=""/>
+      <w:lvlJc w:val="left"/>
+      <w:pPr>
+        <w:tabs>
+          <w:tab w:val="num" w:pos="5760"/>
+        </w:tabs>
+        <w:ind w:left="5760" w:hanging="360"/>
+      </w:pPr>
+      <w:rPr>
+        <w:rFonts w:ascii="Wingdings" w:hAnsi="Wingdings" w:hint="default"/>
+        <w:sz w:val="20"/>
+      </w:rPr>
+    </w:lvl>
+    <w:lvl w:ilvl="8" w:tentative="1">
+      <w:start w:val="1"/>
+      <w:numFmt w:val="bullet"/>
+      <w:lvlText w:val=""/>
+      <w:lvlJc w:val="left"/>
+      <w:pPr>
+        <w:tabs>
+          <w:tab w:val="num" w:pos="6480"/>
+        </w:tabs>
+        <w:ind w:left="6480" w:hanging="360"/>
+      </w:pPr>
+      <w:rPr>
+        <w:rFonts w:ascii="Wingdings" w:hAnsi="Wingdings" w:hint="default"/>
+        <w:sz w:val="20"/>
+      </w:rPr>
+    </w:lvl>
+  </w:abstractNum>
+  <w:abstractNum w:abstractNumId="4" w15:restartNumberingAfterBreak="0">
     <w:nsid w:val="3E155F4E"/>
     <w:multiLevelType w:val="multilevel"/>
     <w:tmpl w:val="94EEF6AE"/>
@@ -6821,7 +7224,7 @@
       </w:rPr>
     </w:lvl>
   </w:abstractNum>
-  <w:abstractNum w:abstractNumId="4" w15:restartNumberingAfterBreak="0">
+  <w:abstractNum w:abstractNumId="5" w15:restartNumberingAfterBreak="0">
     <w:nsid w:val="3F9F68BD"/>
     <w:multiLevelType w:val="multilevel"/>
     <w:tmpl w:val="B17C6854"/>
@@ -6934,7 +7337,7 @@
       </w:rPr>
     </w:lvl>
   </w:abstractNum>
-  <w:abstractNum w:abstractNumId="5" w15:restartNumberingAfterBreak="0">
+  <w:abstractNum w:abstractNumId="6" w15:restartNumberingAfterBreak="0">
     <w:nsid w:val="614E35B2"/>
     <w:multiLevelType w:val="multilevel"/>
     <w:tmpl w:val="7756AAB2"/>
@@ -7047,7 +7450,7 @@
       </w:pPr>
     </w:lvl>
   </w:abstractNum>
-  <w:abstractNum w:abstractNumId="6" w15:restartNumberingAfterBreak="0">
+  <w:abstractNum w:abstractNumId="7" w15:restartNumberingAfterBreak="0">
     <w:nsid w:val="67E87D00"/>
     <w:multiLevelType w:val="multilevel"/>
     <w:tmpl w:val="3DBCC24E"/>
@@ -7197,7 +7600,7 @@
       </w:rPr>
     </w:lvl>
   </w:abstractNum>
-  <w:abstractNum w:abstractNumId="7" w15:restartNumberingAfterBreak="0">
+  <w:abstractNum w:abstractNumId="8" w15:restartNumberingAfterBreak="0">
     <w:nsid w:val="6B99107F"/>
     <w:multiLevelType w:val="multilevel"/>
     <w:tmpl w:val="CDCCA16C"/>
@@ -7348,10 +7751,10 @@
     </w:lvl>
   </w:abstractNum>
   <w:num w:numId="1" w16cid:durableId="224031640">
-    <w:abstractNumId w:val="5"/>
+    <w:abstractNumId w:val="6"/>
   </w:num>
   <w:num w:numId="2" w16cid:durableId="1943684600">
-    <w:abstractNumId w:val="4"/>
+    <w:abstractNumId w:val="5"/>
   </w:num>
   <w:num w:numId="3" w16cid:durableId="947355357">
     <w:abstractNumId w:val="0"/>
@@ -7360,16 +7763,19 @@
     <w:abstractNumId w:val="1"/>
   </w:num>
   <w:num w:numId="5" w16cid:durableId="480579714">
-    <w:abstractNumId w:val="6"/>
+    <w:abstractNumId w:val="7"/>
   </w:num>
   <w:num w:numId="6" w16cid:durableId="2131894812">
     <w:abstractNumId w:val="2"/>
   </w:num>
   <w:num w:numId="7" w16cid:durableId="1730496854">
-    <w:abstractNumId w:val="3"/>
+    <w:abstractNumId w:val="4"/>
   </w:num>
   <w:num w:numId="8" w16cid:durableId="649021436">
-    <w:abstractNumId w:val="7"/>
+    <w:abstractNumId w:val="8"/>
+  </w:num>
+  <w:num w:numId="9" w16cid:durableId="1601793468">
+    <w:abstractNumId w:val="3"/>
   </w:num>
 </w:numbering>
 </file>
@@ -7978,7 +8384,6 @@
   <w:style w:type="character" w:default="1" w:styleId="Fontdeparagrafimplicit">
     <w:name w:val="Default Paragraph Font"/>
     <w:uiPriority w:val="1"/>
-    <w:semiHidden/>
     <w:unhideWhenUsed/>
   </w:style>
   <w:style w:type="table" w:default="1" w:styleId="TabelNormal">

</xml_diff>